<commit_message>
Visa programme: fade background watermark, fix empty page, add stamped PDF
Word template (programme détaillé):
- Fade the first-page ministry banner (alphaModFix) so overlaid text is
  readable, matching the already-washed-out even/default headers
- Collapse 13 trailing empty paragraphs after {PROGRAMME} to one,
  removing the blank trailing page

New stamped PDF export (/visa/[id]/pdf):
- Official-looking programme with the ministry letterhead banner, an
  info table (wilaya, dates, wilayas concernées, pax, durée), the
  day-by-day programme, and the agency stamp — printable where cPanel
  cannot convert docx to PDF
</commit_message>
<xml_diff>
--- a/templates/programme-template.docx
+++ b/templates/programme-template.docx
@@ -440,126 +440,6 @@
               </w:rPr>
               <w:t xml:space="preserve">{PROGRAMME}</w:t>
             </w:r>
-          </w:p>
-          <w:p>
-            <w:pPr>
-              <w:rPr>
-                <w:i/>
-                <w:iCs/>
-                <w:sz w:val="28"/>
-                <w:szCs w:val="28"/>
-              </w:rPr>
-            </w:pPr>
-          </w:p>
-          <w:p>
-            <w:pPr>
-              <w:rPr>
-                <w:i/>
-                <w:iCs/>
-                <w:sz w:val="28"/>
-                <w:szCs w:val="28"/>
-              </w:rPr>
-            </w:pPr>
-          </w:p>
-          <w:p>
-            <w:pPr>
-              <w:rPr>
-                <w:i/>
-                <w:iCs/>
-                <w:sz w:val="28"/>
-                <w:szCs w:val="28"/>
-              </w:rPr>
-            </w:pPr>
-          </w:p>
-          <w:p>
-            <w:pPr>
-              <w:rPr>
-                <w:i/>
-                <w:iCs/>
-                <w:sz w:val="28"/>
-                <w:szCs w:val="28"/>
-              </w:rPr>
-            </w:pPr>
-          </w:p>
-          <w:p>
-            <w:pPr>
-              <w:rPr>
-                <w:i/>
-                <w:iCs/>
-                <w:sz w:val="28"/>
-                <w:szCs w:val="28"/>
-              </w:rPr>
-            </w:pPr>
-          </w:p>
-          <w:p>
-            <w:pPr>
-              <w:rPr>
-                <w:i/>
-                <w:iCs/>
-                <w:sz w:val="28"/>
-                <w:szCs w:val="28"/>
-              </w:rPr>
-            </w:pPr>
-          </w:p>
-          <w:p>
-            <w:pPr>
-              <w:rPr>
-                <w:i/>
-                <w:iCs/>
-                <w:sz w:val="28"/>
-                <w:szCs w:val="28"/>
-              </w:rPr>
-            </w:pPr>
-          </w:p>
-          <w:p>
-            <w:pPr>
-              <w:rPr>
-                <w:i/>
-                <w:iCs/>
-                <w:sz w:val="28"/>
-                <w:szCs w:val="28"/>
-              </w:rPr>
-            </w:pPr>
-          </w:p>
-          <w:p>
-            <w:pPr>
-              <w:rPr>
-                <w:i/>
-                <w:iCs/>
-                <w:sz w:val="28"/>
-                <w:szCs w:val="28"/>
-              </w:rPr>
-            </w:pPr>
-          </w:p>
-          <w:p>
-            <w:pPr>
-              <w:rPr>
-                <w:i/>
-                <w:iCs/>
-                <w:sz w:val="28"/>
-                <w:szCs w:val="28"/>
-              </w:rPr>
-            </w:pPr>
-          </w:p>
-          <w:p>
-            <w:pPr>
-              <w:rPr>
-                <w:i/>
-                <w:iCs/>
-                <w:sz w:val="28"/>
-                <w:szCs w:val="28"/>
-              </w:rPr>
-            </w:pPr>
-          </w:p>
-          <w:p>
-            <w:pPr>
-              <w:rPr>
-                <w:i/>
-                <w:iCs/>
-                <w:sz w:val="28"/>
-                <w:szCs w:val="28"/>
-              </w:rPr>
-            </w:pPr>
           </w:p>
           <w:p>
             <w:pPr>
@@ -1034,6 +914,7 @@
                 </pic:nvPicPr>
                 <pic:blipFill>
                   <a:blip r:embed="rId1" cstate="print">
+                    <a:alphaModFix amt="35000"/>
                     <a:extLst>
                       <a:ext uri="{28A0092B-C50C-407E-A947-70E740481C1C}">
                         <a14:useLocalDpi xmlns:a14="http://schemas.microsoft.com/office/drawing/2010/main" xmlns:wps="http://schemas.microsoft.com/office/word/2010/wordprocessingShape" xmlns:wpi="http://schemas.microsoft.com/office/word/2010/wordprocessingInk" xmlns:wpg="http://schemas.microsoft.com/office/word/2010/wordprocessingGroup" xmlns:w15="http://schemas.microsoft.com/office/word/2012/wordml" xmlns:w14="http://schemas.microsoft.com/office/word/2010/wordml" xmlns:w="http://schemas.openxmlformats.org/wordprocessingml/2006/main" xmlns:w10="urn:schemas-microsoft-com:office:word" xmlns:wp14="http://schemas.microsoft.com/office/word/2010/wordprocessingDrawing" xmlns:v="urn:schemas-microsoft-com:vml" xmlns:o="urn:schemas-microsoft-com:office:office" xmlns:mc="http://schemas.openxmlformats.org/markup-compatibility/2006" xmlns:wpc="http://schemas.microsoft.com/office/word/2010/wordprocessingCanvas" xmlns="" val="0"/>
@@ -1615,16 +1496,4 @@
     </a:ext>
   </a:extLst>
 </a:theme>
-</file>
-
-<file path=customXml/item1.xml><?xml version="1.0" encoding="utf-8"?>
-<b:Sources xmlns:b="http://schemas.openxmlformats.org/officeDocument/2006/bibliography" xmlns="http://schemas.openxmlformats.org/officeDocument/2006/bibliography" SelectedStyle="\APASixthEditionOfficeOnline.xsl" StyleName="APA" Version="6"/>
-</file>
-
-<file path=customXml/itemProps1.xml><?xml version="1.0" encoding="utf-8"?>
-<ds:datastoreItem xmlns:ds="http://schemas.openxmlformats.org/officeDocument/2006/customXml" ds:itemID="{1DF3D9E7-95DD-4EDC-A6F0-AE5EAC677F4A}">
-  <ds:schemaRefs>
-    <ds:schemaRef ds:uri="http://schemas.openxmlformats.org/officeDocument/2006/bibliography"/>
-  </ds:schemaRefs>
-</ds:datastoreItem>
 </file>
</xml_diff>